<commit_message>
Updated study notes and resources across all languages with extensive revisions in 1822 files for 2026-03-25 release.
</commit_message>
<xml_diff>
--- a/eng/docx/13.content.docx
+++ b/eng/docx/13.content.docx
@@ -9216,7 +9216,7 @@
         <w:rPr>
           <w:lang w:val="en_US" w:bidi="en_US"/>
         </w:rPr>
-        <w:t xml:space="preserve"> is likely a melody sung in a soprano range. It relates to the Hebrew word </w:t>
+        <w:t xml:space="preserve"> is likely a melody sung in a soprano range. The word may be related to the Hebrew word </w:t>
       </w:r>
       <w:r>
         <w:rPr>
@@ -9229,7 +9229,7 @@
         <w:rPr>
           <w:lang w:val="en_US" w:bidi="en_US"/>
         </w:rPr>
-        <w:t>meaning “young woman.”</w:t>
+        <w:t>which means “young woman.”</w:t>
       </w:r>
       <w:r>
         <w:rPr>

</xml_diff>